<commit_message>
db: drop BEGIN/COMMIT from SQL files for driver-managed transactions
</commit_message>
<xml_diff>
--- a/db/Описание_БД.docx
+++ b/db/Описание_БД.docx
@@ -7606,6 +7606,15 @@
       </w:pPr>
       <w:r>
         <w:t>Описание_БД.docx — настоящий документ.</w:t>
+      </w:r>
+    </w:p>
+    <w:p>
+      <w:r>
+        <w:rPr>
+          <w:b w:val="0"/>
+          <w:i/>
+        </w:rPr>
+        <w:t>Правка от 24.10.2026 по запросу бэкенда: из всех пяти SQL-файлов удалены BEGIN/COMMIT — они конфликтовали с транзакцией, которой source.py выполняет сид (TRUNCATE в сиде отсутствует и выполняется снаружи). Атомарность через psql восстанавливается флагом «psql -1 -f»; LOCK TABLE и защита «сид только на пустые таблицы» сохранены. Правка перепроверена на живой БД.</w:t>
       </w:r>
     </w:p>
     <w:sectPr>

</xml_diff>